<commit_message>
Make all resumes and cover letters ATS-compliant tagged PDFs
Single-column layout with dates on the employer line, standard section headings,
comma-separated skills without line-break-prone hyphens, one certification per
line, and searchable document properties. Wording tightened to match the base
resume exactly. Verified by text extraction on every PDF.

Co-Authored-By: Claude Opus 5.5 <noreply@anthropic.com>
Claude-Session: https://claude.ai/code/session_019tntYSrHey6kwf7MGLhRbK
</commit_message>
<xml_diff>
--- a/Job Applications - Oct 2026/01 Queens University - Project Coordinator Research/Adekunle_Adeniji_Resume_Queens_Project_Coordinator_Research.docx
+++ b/Job Applications - Oct 2026/01 Queens University - Project Coordinator Research/Adekunle_Adeniji_Resume_Queens_Project_Coordinator_Research.docx
@@ -66,7 +66,7 @@
         <w:pStyle w:val="Heading1"/>
       </w:pPr>
       <w:r>
-        <w:t xml:space="preserve">CORE SKILLS</w:t>
+        <w:t xml:space="preserve">SKILLS</w:t>
       </w:r>
     </w:p>
     <w:p>
@@ -74,7 +74,7 @@
         <w:spacing w:after="60"/>
       </w:pPr>
       <w:r>
-        <w:t xml:space="preserve">Research Project Coordination  |  Project Planning and Scheduling  |  Milestone and Deliverable Tracking  |  Budget Monitoring and Variance Analysis  |  Survey Design and Analysis  |  Program Evaluation  |  Research and Academic Writing  |  Documentation and Version Control  |  Meeting Coordination and Minutes  |  Stakeholder and Partner Coordination  |  Risk and Issue Management  |  Status Reporting and Dashboards  |  Vendor and Supplier Coordination  |  Agile and Hybrid Delivery</w:t>
+        <w:t xml:space="preserve">Research Project Coordination, Project Planning and Scheduling, Milestone and Deliverable Tracking, Budget Monitoring and Variance Analysis, Survey Design and Analysis, Program Evaluation, Research and Academic Writing, Documentation and Version Control, Meeting Coordination and Minutes, Stakeholder and Partner Coordination, Risk and Issue Management, Status Reporting and Dashboards, Vendor and Supplier Coordination, Agile and Hybrid Delivery</w:t>
       </w:r>
     </w:p>
     <w:p>
@@ -82,7 +82,7 @@
         <w:pStyle w:val="Heading1"/>
       </w:pPr>
       <w:r>
-        <w:t xml:space="preserve">SELECTED PROJECT MANAGEMENT COMPETENCIES</w:t>
+        <w:t xml:space="preserve">CORE COMPETENCIES</w:t>
       </w:r>
     </w:p>
     <w:p>
@@ -196,9 +196,6 @@
     <w:p>
       <w:pPr>
         <w:keepNext/>
-        <w:tabs>
-          <w:tab w:val="right" w:pos="10800"/>
-        </w:tabs>
         <w:spacing w:after="0" w:before="60"/>
       </w:pPr>
       <w:r>
@@ -210,14 +207,6 @@
         </w:rPr>
         <w:t xml:space="preserve">Project Manager and Program Lead</w:t>
       </w:r>
-      <w:r>
-        <w:rPr>
-          <w:b/>
-          <w:bCs/>
-        </w:rPr>
-        <w:tab/>
-        <w:t xml:space="preserve">2025 – Present</w:t>
-      </w:r>
     </w:p>
     <w:p>
       <w:pPr>
@@ -231,6 +220,9 @@
         </w:rPr>
         <w:t xml:space="preserve">Emole Futures Initiative Inc., Kingston, Ontario</w:t>
       </w:r>
+      <w:r>
+        <w:t xml:space="preserve">  |  2025 - Present</w:t>
+      </w:r>
     </w:p>
     <w:p>
       <w:pPr>
@@ -313,9 +305,6 @@
     <w:p>
       <w:pPr>
         <w:keepNext/>
-        <w:tabs>
-          <w:tab w:val="right" w:pos="10800"/>
-        </w:tabs>
         <w:spacing w:after="0" w:before="60"/>
       </w:pPr>
       <w:r>
@@ -327,14 +316,6 @@
         </w:rPr>
         <w:t xml:space="preserve">Project Coordinator, Arts of Africa (Curatorial Residency)</w:t>
       </w:r>
-      <w:r>
-        <w:rPr>
-          <w:b/>
-          <w:bCs/>
-        </w:rPr>
-        <w:tab/>
-        <w:t xml:space="preserve">January 2025 – July 2025</w:t>
-      </w:r>
     </w:p>
     <w:p>
       <w:pPr>
@@ -348,6 +329,9 @@
         </w:rPr>
         <w:t xml:space="preserve">The Metropolitan Museum of Art, New York, NY</w:t>
       </w:r>
+      <w:r>
+        <w:t xml:space="preserve">  |  January 2025 - July 2025</w:t>
+      </w:r>
     </w:p>
     <w:p>
       <w:pPr>
@@ -404,9 +388,6 @@
     <w:p>
       <w:pPr>
         <w:keepNext/>
-        <w:tabs>
-          <w:tab w:val="right" w:pos="10800"/>
-        </w:tabs>
         <w:spacing w:after="0" w:before="60"/>
       </w:pPr>
       <w:r>
@@ -418,14 +399,6 @@
         </w:rPr>
         <w:t xml:space="preserve">Exhibition Project Coordinator and Curatorial Fellow</w:t>
       </w:r>
-      <w:r>
-        <w:rPr>
-          <w:b/>
-          <w:bCs/>
-        </w:rPr>
-        <w:tab/>
-        <w:t xml:space="preserve">January 2022 – May 2023</w:t>
-      </w:r>
     </w:p>
     <w:p>
       <w:pPr>
@@ -439,6 +412,9 @@
         </w:rPr>
         <w:t xml:space="preserve">Denver Art Museum, Denver, CO</w:t>
       </w:r>
+      <w:r>
+        <w:t xml:space="preserve">  |  January 2022 - May 2023</w:t>
+      </w:r>
     </w:p>
     <w:p>
       <w:pPr>
@@ -495,9 +471,6 @@
     <w:p>
       <w:pPr>
         <w:keepNext/>
-        <w:tabs>
-          <w:tab w:val="right" w:pos="10800"/>
-        </w:tabs>
         <w:spacing w:after="0" w:before="60"/>
       </w:pPr>
       <w:r>
@@ -509,14 +482,6 @@
         </w:rPr>
         <w:t xml:space="preserve">Project and Curatorial Intern</w:t>
       </w:r>
-      <w:r>
-        <w:rPr>
-          <w:b/>
-          <w:bCs/>
-        </w:rPr>
-        <w:tab/>
-        <w:t xml:space="preserve">July 2021 – November 2021</w:t>
-      </w:r>
     </w:p>
     <w:p>
       <w:pPr>
@@ -530,6 +495,9 @@
         </w:rPr>
         <w:t xml:space="preserve">Smithsonian National Museum of African Art, Washington, DC</w:t>
       </w:r>
+      <w:r>
+        <w:t xml:space="preserve">  |  July 2021 - November 2021</w:t>
+      </w:r>
     </w:p>
     <w:p>
       <w:pPr>
@@ -555,9 +523,6 @@
     <w:p>
       <w:pPr>
         <w:keepNext/>
-        <w:tabs>
-          <w:tab w:val="right" w:pos="10800"/>
-        </w:tabs>
         <w:spacing w:after="0" w:before="40"/>
       </w:pPr>
       <w:r>
@@ -566,14 +531,6 @@
           <w:bCs/>
         </w:rPr>
         <w:t xml:space="preserve">Master of Digital Product Management</w:t>
-      </w:r>
-      <w:r>
-        <w:rPr>
-          <w:b/>
-          <w:bCs/>
-        </w:rPr>
-        <w:tab/>
-        <w:t xml:space="preserve">Expected 2027</w:t>
       </w:r>
     </w:p>
     <w:p>
@@ -587,13 +544,13 @@
         </w:rPr>
         <w:t xml:space="preserve">Smith School of Business, Queen's University, Kingston, Ontario</w:t>
       </w:r>
+      <w:r>
+        <w:t xml:space="preserve">  |  Expected 2027</w:t>
+      </w:r>
     </w:p>
     <w:p>
       <w:pPr>
         <w:keepNext/>
-        <w:tabs>
-          <w:tab w:val="right" w:pos="10800"/>
-        </w:tabs>
         <w:spacing w:after="0" w:before="40"/>
       </w:pPr>
       <w:r>
@@ -602,14 +559,6 @@
           <w:bCs/>
         </w:rPr>
         <w:t xml:space="preserve">Graduate Certificate, Project Management (Co-op)</w:t>
-      </w:r>
-      <w:r>
-        <w:rPr>
-          <w:b/>
-          <w:bCs/>
-        </w:rPr>
-        <w:tab/>
-        <w:t xml:space="preserve">2026</w:t>
       </w:r>
     </w:p>
     <w:p>
@@ -623,13 +572,13 @@
         </w:rPr>
         <w:t xml:space="preserve">Sheridan College, Ontario</w:t>
       </w:r>
+      <w:r>
+        <w:t xml:space="preserve">  |  2026</w:t>
+      </w:r>
     </w:p>
     <w:p>
       <w:pPr>
         <w:keepNext/>
-        <w:tabs>
-          <w:tab w:val="right" w:pos="10800"/>
-        </w:tabs>
         <w:spacing w:after="0" w:before="40"/>
       </w:pPr>
       <w:r>
@@ -638,14 +587,6 @@
           <w:bCs/>
         </w:rPr>
         <w:t xml:space="preserve">Master of Arts, Art History</w:t>
-      </w:r>
-      <w:r>
-        <w:rPr>
-          <w:b/>
-          <w:bCs/>
-        </w:rPr>
-        <w:tab/>
-        <w:t xml:space="preserve">2025</w:t>
       </w:r>
     </w:p>
     <w:p>
@@ -659,13 +600,16 @@
         </w:rPr>
         <w:t xml:space="preserve">Queen's University, Kingston, Ontario</w:t>
       </w:r>
+      <w:r>
+        <w:t xml:space="preserve">  |  2025</w:t>
+      </w:r>
     </w:p>
     <w:p>
       <w:pPr>
         <w:pStyle w:val="Heading1"/>
       </w:pPr>
       <w:r>
-        <w:t xml:space="preserve">CERTIFICATIONS AND TRAINING</w:t>
+        <w:t xml:space="preserve">CERTIFICATIONS</w:t>
       </w:r>
     </w:p>
     <w:p>
@@ -685,7 +629,7 @@
         <w:t xml:space="preserve">Google Project Management Certificate</w:t>
       </w:r>
       <w:r>
-        <w:t xml:space="preserve"> – Scope, schedules, risk, Agile, and stakeholder management</w:t>
+        <w:t xml:space="preserve"> - Scope, schedules, risk, Agile, and stakeholder management</w:t>
       </w:r>
     </w:p>
     <w:p>
@@ -705,7 +649,7 @@
         <w:t xml:space="preserve">Google Agile Project Management</w:t>
       </w:r>
       <w:r>
-        <w:t xml:space="preserve"> – Sprint frameworks, Scrum events, and Agile delivery</w:t>
+        <w:t xml:space="preserve"> - Sprint frameworks, Scrum events, and Agile delivery</w:t>
       </w:r>
     </w:p>
     <w:p>
@@ -725,7 +669,7 @@
         <w:t xml:space="preserve">IBM, Agile Development and Scrum</w:t>
       </w:r>
       <w:r>
-        <w:t xml:space="preserve"> – User stories, backlog refinement, and sprint execution</w:t>
+        <w:t xml:space="preserve"> - User stories, backlog refinement, and sprint execution</w:t>
       </w:r>
     </w:p>
     <w:p>
@@ -745,7 +689,7 @@
         <w:t xml:space="preserve">SkillUp, Introduction to the Scrum Master Profession</w:t>
       </w:r>
       <w:r>
-        <w:t xml:space="preserve"> – Scrum roles, ceremonies, and servant leadership</w:t>
+        <w:t xml:space="preserve"> - Scrum roles, ceremonies, and servant leadership</w:t>
       </w:r>
     </w:p>
     <w:p>
@@ -765,7 +709,27 @@
         <w:t xml:space="preserve">IBM, Generative AI for Product Managers</w:t>
       </w:r>
       <w:r>
-        <w:t xml:space="preserve"> and IBM, Product Management: An Introduction</w:t>
+        <w:t xml:space="preserve"> - AI-augmented product strategy and workflows</w:t>
+      </w:r>
+    </w:p>
+    <w:p>
+      <w:pPr>
+        <w:pStyle w:val="ListParagraph"/>
+        <w:numPr>
+          <w:ilvl w:val="0"/>
+          <w:numId w:val="2"/>
+        </w:numPr>
+        <w:spacing w:after="0"/>
+      </w:pPr>
+      <w:r>
+        <w:rPr>
+          <w:b/>
+          <w:bCs/>
+        </w:rPr>
+        <w:t xml:space="preserve">IBM, Product Management: An Introduction</w:t>
+      </w:r>
+      <w:r>
+        <w:t xml:space="preserve"> - Product lifecycle, discovery, and roadmapping</w:t>
       </w:r>
     </w:p>
     <w:p>

</xml_diff>